<commit_message>
cleaned up repository for final submission
</commit_message>
<xml_diff>
--- a/docs/Team12_Smart_Archive_Agent_Reviews_1-3.docx
+++ b/docs/Team12_Smart_Archive_Agent_Reviews_1-3.docx
@@ -18266,7 +18266,7 @@
                 <w:color w:val="000000"/>
                 <w:sz w:val="16"/>
               </w:rPr>
-              <w:t>│   ├── Review_1/2/3_Smart_Archive_Agent (.docx, .pdf)   our review reports</w:t>
+              <w:t>│   ├── Team12_Smart_Archive_Agent_Reviews_1-3 (.docx, .pdf)   this combined document</w:t>
             </w:r>
             <w:r>
               <w:br/>
@@ -18277,7 +18277,7 @@
                 <w:color w:val="000000"/>
                 <w:sz w:val="16"/>
               </w:rPr>
-              <w:t>│   ├── Team12_Smart_Archive_Agent_Reviews_1-3 (.docx, .pdf)   this combined document</w:t>
+              <w:t>│   ├── architecture.png, workflow.png    Figures 3.1 and 4.1</w:t>
             </w:r>
             <w:r>
               <w:br/>
@@ -18288,7 +18288,7 @@
                 <w:color w:val="000000"/>
                 <w:sz w:val="16"/>
               </w:rPr>
-              <w:t>│   ├── Review 1/2/3 Template.docx  the review templates</w:t>
+              <w:t>│   └── architecture.md, api.md, usage.md  technical notes</w:t>
             </w:r>
             <w:r>
               <w:br/>
@@ -18299,7 +18299,7 @@
                 <w:color w:val="000000"/>
                 <w:sz w:val="16"/>
               </w:rPr>
-              <w:t>│   ├── architecture.png, workflow.png    Figures 3.1 and 4.1</w:t>
+              <w:t>├── README.md                       overview and step-by-step setup for our teacher</w:t>
             </w:r>
             <w:r>
               <w:br/>
@@ -18310,62 +18310,7 @@
                 <w:color w:val="000000"/>
                 <w:sz w:val="16"/>
               </w:rPr>
-              <w:t>│   ├── architecture.md, api.md, usage.md  technical notes</w:t>
-            </w:r>
-            <w:r>
-              <w:br/>
-            </w:r>
-            <w:r>
-              <w:rPr>
-                <w:rFonts w:ascii="Consolas" w:hAnsi="Consolas"/>
-                <w:color w:val="000000"/>
-                <w:sz w:val="16"/>
-              </w:rPr>
-              <w:t>│   └── PROJECT_MEMORY.md           our project decisions</w:t>
-            </w:r>
-            <w:r>
-              <w:br/>
-            </w:r>
-            <w:r>
-              <w:rPr>
-                <w:rFonts w:ascii="Consolas" w:hAnsi="Consolas"/>
-                <w:color w:val="000000"/>
-                <w:sz w:val="16"/>
-              </w:rPr>
-              <w:t>├── README.md                       overview and step-by-step setup for our teacher</w:t>
-            </w:r>
-            <w:r>
-              <w:br/>
-            </w:r>
-            <w:r>
-              <w:rPr>
-                <w:rFonts w:ascii="Consolas" w:hAnsi="Consolas"/>
-                <w:color w:val="000000"/>
-                <w:sz w:val="16"/>
-              </w:rPr>
               <w:t>├── INTEGRATION.md                  how to plug the agent into the Agentic Shell</w:t>
-            </w:r>
-            <w:r>
-              <w:br/>
-            </w:r>
-            <w:r>
-              <w:rPr>
-                <w:rFonts w:ascii="Consolas" w:hAnsi="Consolas"/>
-                <w:color w:val="000000"/>
-                <w:sz w:val="16"/>
-              </w:rPr>
-              <w:t>├── SHOWCASE.md                     how we demonstrate the agent</w:t>
-            </w:r>
-            <w:r>
-              <w:br/>
-            </w:r>
-            <w:r>
-              <w:rPr>
-                <w:rFonts w:ascii="Consolas" w:hAnsi="Consolas"/>
-                <w:color w:val="000000"/>
-                <w:sz w:val="16"/>
-              </w:rPr>
-              <w:t>├── refer.md                        our viva notes</w:t>
             </w:r>
             <w:r>
               <w:br/>
@@ -18515,7 +18460,7 @@
           <w:rFonts w:ascii="Calibri" w:hAnsi="Calibri"/>
           <w:color w:val="000000"/>
         </w:rPr>
-        <w:t xml:space="preserve"> all three review reports, this combined document and the figures.</w:t>
+        <w:t xml:space="preserve"> this combined document with all three reviews, and the figures.</w:t>
       </w:r>
     </w:p>
     <w:p>

</xml_diff>